<commit_message>
fix(P8): resolve CRITICAL estimation-N + TCI label across 3 packages
- Abstract + first results: state estimation N=209 complete cases vs full
  N=959 sample (verified vs reanalysis CSV) - resolves the 959-vs-209 CRITICAL.
- Remove erroneous '(n.s.)' from TCI_z (p=.003 is significant); other n.s. verified.
- Add missing Mahler et al. (2026) ref (verbatim); fix spaced thousands in wd/ejdr.
- Table 1 (country-level stats) FLAGGED [AUTHOR ACTION] - no per-country data file
  exists; not fabricated.
</commit_message>
<xml_diff>
--- a/p8/submission/ejdr_package/01_manuscript_blinded.docx
+++ b/p8/submission/ejdr_package/01_manuscript_blinded.docx
@@ -59,7 +59,7 @@
         <w:t xml:space="preserve">Forced Internationalization Penalty (FIP)</w:t>
       </w:r>
       <w:r>
-        <w:t xml:space="preserve">. Unlike the downward phase-1 slope in three-stage internationalization theory, FIP is not a transient learning cost with an eventual turning point; it is a persistent structural condition arising from the compulsion to export despite systemic disadvantages. Using World Bank Enterprise Survey data from 959 firms across seven Pacific SIDS economies (2009–2025), we find that internationalization intensity is robustly and negatively associated with labor productivity (β = −1.339, p &lt; .001 in the country-and-year fixed-effects specification; β = −3.351, p &lt; .001 without country fixed effects), with no significant quadratic curvature. Neither technological capability nor digital adoption moderates the negative export–performance slope in the SIDS environment, although technological capability does raise the overall productivity level, consistent with the FIP mechanism: when structural prerequisites are absent, firm-level capabilities cannot redirect the I-P relationship toward positive territory. The findings reframe the inverted-U paradigm as conditional rather than universal, identify boundary conditions for institutional moderation theory, and carry direct implications for the Antigua and Barbuda Agenda for SIDS.</w:t>
+        <w:t xml:space="preserve">. Unlike the downward phase-1 slope in three-stage internationalization theory, FIP is not a transient learning cost with an eventual turning point; it is a persistent structural condition arising from the compulsion to export despite systemic disadvantages. Using World Bank Enterprise Survey data from 959 firms across seven Pacific SIDS economies (2009–2025), we find that internationalization intensity is robustly and negatively associated with labor productivity (β = −1.339, p &lt; .001 in the country-and-year fixed-effects specification; β = −3.351, p &lt; .001 without country fixed effects; estimation N = 209 complete cases, from the full analysis sample of N = 959), with no significant quadratic curvature. Neither technological capability nor digital adoption moderates the negative export–performance slope in the SIDS environment, although technological capability does raise the overall productivity level, consistent with the FIP mechanism: when structural prerequisites are absent, firm-level capabilities cannot redirect the I-P relationship toward positive territory. The findings reframe the inverted-U paradigm as conditional rather than universal, identify boundary conditions for institutional moderation theory, and carry direct implications for the Antigua and Barbuda Agenda for SIDS.</w:t>
       </w:r>
     </w:p>
     <w:bookmarkEnd w:id="20"/>
@@ -146,7 +146,7 @@
         <w:pStyle w:val="BodyText"/>
       </w:pPr>
       <w:r>
-        <w:t xml:space="preserve">SIDS represent a theoretically extreme yet empirically underserved context for I-P research. These economies are characterized by microscopic domestic markets (Tonga: 104, 000 inhabitants; Kiribati: 121, 000), extreme geographic isolation amplifying trade costs by 30–210% (Winters &amp; Martins, 2004), and comprehensive institutional voids that limit firms' ability to appropriate returns from international activities (Briguglio, 1995; Khanna &amp; Palepu, 2010). Recent systematic tracking across 121, 249 development data points confirms these conditions have deepened rather than abated: progress in 2020–2025 is the slowest on record across 15 of 26 tracked benchmarks, with SIDS and Sub-Saharan Africa disproportionately affected (Pirlea et al., 2026). Independent multi-indicator analysis of six development dimensions poverty, life expectancy, schooling, gender equality, climate, and electricity, finds the world developing at its slowest pace in 75 years, with 54 economies more than a century from reaching developed-country standards at current trajectories, and SIDS disproportionately represented in this cohort (Mahler, Serajuddin, Wadhwa, &amp; Yonzan, 2026). Critically, firms in SIDS do not</w:t>
+        <w:t xml:space="preserve">SIDS represent a theoretically extreme yet empirically underserved context for I-P research. These economies are characterized by microscopic domestic markets (Tonga: 104,000 inhabitants; Kiribati: 121,000), extreme geographic isolation amplifying trade costs by 30–210% (Winters &amp; Martins, 2004), and comprehensive institutional voids that limit firms' ability to appropriate returns from international activities (Briguglio, 1995; Khanna &amp; Palepu, 2010). Recent systematic tracking across 121,249 development data points confirms these conditions have deepened rather than abated: progress in 2020–2025 is the slowest on record across 15 of 26 tracked benchmarks, with SIDS and Sub-Saharan Africa disproportionately affected (Pirlea et al., 2026). Independent multi-indicator analysis of six development dimensions poverty, life expectancy, schooling, gender equality, climate, and electricity, finds the world developing at its slowest pace in 75 years, with 54 economies more than a century from reaching developed-country standards at current trajectories, and SIDS disproportionately represented in this cohort (Mahler, Serajuddin, Wadhwa, &amp; Yonzan, 2026). Critically, firms in SIDS do not</w:t>
       </w:r>
       <w:r>
         <w:t xml:space="preserve"> </w:t>
@@ -437,7 +437,7 @@
         <w:pStyle w:val="FirstParagraph"/>
       </w:pPr>
       <w:r>
-        <w:t xml:space="preserve">Pacific SIDS economies exhibit all three violated prerequisites in extreme form. With populations ranging from 94, 000 (Micronesia) to 10 million (Papua New Guinea, the largest in our sample), domestic markets cannot sustain manufacturing or service firms at minimum efficient scale. Read (2004) demonstrated that the smallest island economies have effectively no choice architecture for export abstention, firms either export or exit. We term this pattern</w:t>
+        <w:t xml:space="preserve">Pacific SIDS economies exhibit all three violated prerequisites in extreme form. With populations ranging from 94,000 (Micronesia) to 10 million (Papua New Guinea, the largest in our sample), domestic markets cannot sustain manufacturing or service firms at minimum efficient scale. Read (2004) demonstrated that the smallest island economies have effectively no choice architecture for export abstention, firms either export or exit. We term this pattern</w:t>
       </w:r>
       <w:r>
         <w:t xml:space="preserve"> </w:t>
@@ -575,7 +575,7 @@
         <w:pStyle w:val="FirstParagraph"/>
       </w:pPr>
       <w:r>
-        <w:t xml:space="preserve">We use pooled data from the World Bank Enterprise Survey (WBES), drawing waves conducted in Pacific SIDS economies between 2009 and 2025. WBES employs stratified random sampling with probability-proportional-to-size design across firm-size strata (5–19, 20–99, 100+ employees) and sectors (manufacturing, services, retail). We include all firm-year observations from economies meeting the SIDS classification: Fiji, Kiribati, Papua New Guinea, Samoa, Solomon Islands, Tonga, and Vanuatu (seven economies). The analysis sample, observations with non-missing values for labor productivity, export intensity, and firm age, comprises</w:t>
+        <w:t xml:space="preserve">We use pooled data from the World Bank Enterprise Survey (WBES), drawing waves conducted in Pacific SIDS economies between 2009 and 2025. WBES employs stratified random sampling with probability-proportional-to-size design across firm-size strata (5–19, 20–99,100+ employees) and sectors (manufacturing, services, retail). We include all firm-year observations from economies meeting the SIDS classification: Fiji, Kiribati, Papua New Guinea, Samoa, Solomon Islands, Tonga, and Vanuatu (seven economies). The analysis sample, observations with non-missing values for labor productivity, export intensity, and firm age, comprises</w:t>
       </w:r>
       <w:r>
         <w:t xml:space="preserve"> </w:t>
@@ -1617,6 +1617,12 @@
         </w:rPr>
         <w:t xml:space="preserve">&lt;.001</w:t>
       </w:r>
+      <w:r>
+        <w:t xml:space="preserve"> </w:t>
+      </w:r>
+      <w:r>
+        <w:t xml:space="preserve">(estimation N = 209 complete cases; full analysis sample N = 959)</w:t>
+      </w:r>
     </w:p>
     <w:p>
       <w:pPr>
@@ -2170,7 +2176,7 @@
         <w:pStyle w:val="BodyText"/>
       </w:pPr>
       <w:r>
-        <w:t xml:space="preserve">β(TCI_z) = +0.299, SE = 0.099, p = .003 (n.s.) β(DAI_z) = +0.094, SE =</w:t>
+        <w:t xml:space="preserve">β(TCI_z) = +0.299, SE = 0.099, p = .003 β(DAI_z) = +0.094, SE =</w:t>
       </w:r>
       <w:r>
         <w:t xml:space="preserve"> </w:t>
@@ -2184,7 +2190,7 @@
         <w:pStyle w:val="BodyText"/>
       </w:pPr>
       <w:r>
-        <w:t xml:space="preserve">The FIP coefficient (FSTS_c) remains negative and marginally significant in M3 (β = −2.979, p = .056), likely reflecting the substantially reduced sample (N = 205 for M3, versus N = 959 for M1, due to missing capability variables). The direction of the FSTS_c coefficient remains negative and numerically larger in M3, consistent with FIP; the significance loss is attributable to power reduction from the subsample restriction.</w:t>
+        <w:t xml:space="preserve">The FIP coefficient (FSTS_c) remains negative and marginally significant in M3 (β = −2.979, p = .056), likely reflecting the substantially reduced sample (N = 205 for M3, versus N = 209 for M1, both reflecting attrition from the 959-firm analysis sample due to missing control and capability variables). The direction of the FSTS_c coefficient remains negative and numerically larger in M3, consistent with FIP; the significance loss is attributable to power reduction from the subsample restriction.</w:t>
       </w:r>
     </w:p>
     <w:p>
@@ -3102,6 +3108,30 @@
       </w:r>
       <w:r>
         <w:t xml:space="preserve">(4), 598–609.</w:t>
+      </w:r>
+    </w:p>
+    <w:p>
+      <w:pPr>
+        <w:pStyle w:val="BodyText"/>
+      </w:pPr>
+      <w:r>
+        <w:t xml:space="preserve">Mahler, D. G., Serajuddin, U., Wadhwa, D., &amp; Yonzan, N. (2026, April).</w:t>
+      </w:r>
+      <w:r>
+        <w:t xml:space="preserve"> </w:t>
+      </w:r>
+      <w:r>
+        <w:rPr>
+          <w:iCs/>
+          <w:i/>
+        </w:rPr>
+        <w:t xml:space="preserve">The world is developing at its slowest pace in 75 years</w:t>
+      </w:r>
+      <w:r>
+        <w:t xml:space="preserve"> </w:t>
+      </w:r>
+      <w:r>
+        <w:t xml:space="preserve">(Policy Research Working Paper No. 11350). World Bank Group.</w:t>
       </w:r>
     </w:p>
     <w:p>
@@ -4135,34 +4165,20 @@
           <w:iCs/>
           <w:i/>
         </w:rPr>
-        <w:t xml:space="preserve">Note: Country-level breakdowns are available in the replication archive</w:t>
+        <w:t xml:space="preserve">Note: Per-country breakdowns (N, exporter count, exporter %, mean FSTS, wave coverage) are not yet populated. The current replication outputs (</w:t>
+      </w:r>
+      <w:r>
+        <w:rPr>
+          <w:rStyle w:val="VerbatimChar"/>
+        </w:rPr>
+        <w:t xml:space="preserve">p8/replication/reanalysis_7pacific/p8_R_summary.csv</w:t>
       </w:r>
       <w:r>
         <w:rPr>
           <w:iCs/>
           <w:i/>
         </w:rPr>
-        <w:t xml:space="preserve"> </w:t>
-      </w:r>
-      <w:r>
-        <w:rPr>
-          <w:iCs/>
-          <w:i/>
-        </w:rPr>
-        <w:t xml:space="preserve">(</w:t>
-      </w:r>
-      <w:r>
-        <w:rPr>
-          <w:rStyle w:val="VerbatimChar"/>
-        </w:rPr>
-        <w:t xml:space="preserve">p8/replication/</w:t>
-      </w:r>
-      <w:r>
-        <w:rPr>
-          <w:iCs/>
-          <w:i/>
-        </w:rPr>
-        <w:t xml:space="preserve">). Total N reflects analysis sample (non-missing ln_LP and FSTS). Wave coverage varies by country.</w:t>
+        <w:t xml:space="preserve">) report only pooled totals (N = 959; exporters = 132; 13.8%; mean FSTS = 0.048); a per-country descriptives file has not been generated. [AUTHOR ACTION REQUIRED: generate country-level summary statistics from the analysis sample and fill the seven rows below before submission.] Total N reflects analysis sample (non-missing ln_LP and FSTS). Wave coverage varies by country.</w:t>
       </w:r>
     </w:p>
     <w:bookmarkEnd w:id="50"/>

</xml_diff>

<commit_message>
fix(self-review B2-B5): P8 conclusion estimation-N caveat; P9 MIR unstructured abstract; P8 Table1 firm-year obs; P4 mir/apbr N=84 clarification
</commit_message>
<xml_diff>
--- a/p8/submission/ejdr_package/01_manuscript_blinded.docx
+++ b/p8/submission/ejdr_package/01_manuscript_blinded.docx
@@ -2653,7 +2653,7 @@
         <w:pStyle w:val="FirstParagraph"/>
       </w:pPr>
       <w:r>
-        <w:t xml:space="preserve">We introduced the Forced Internationalization Penalty (FIP), the monotone negative effect of internationalization intensity on firm performance when three structural prerequisites of the inverted-U relationship are simultaneously absent: a viable domestic market, manageable trade costs, and functional institutional support. Using WBES data from 959 firms across seven Pacific SIDS economies, we find robust support for FIP across multiple specifications (β = −1.339, p &lt; .001 in the primary country-and-year fixed-effects model; β = −3.351, p &lt; .001 without country fixed effects; β = −1.176, p = .130 in the exporters-only subsample). The quadratic term is not significant, confirming the monotone negative form with no observable turning point. Digital adoption is null and, although technological capability raises the overall productivity level, neither capability moderates the negative export-performance slope, consistent with the FIP theoretical mechanism.</w:t>
+        <w:t xml:space="preserve">We introduced the Forced Internationalization Penalty (FIP), the monotone negative effect of internationalization intensity on firm performance when three structural prerequisites of the inverted-U relationship are simultaneously absent: a viable domestic market, manageable trade costs, and functional institutional support. Using WBES data from 959 firms across seven Pacific SIDS economies, we find robust support for FIP across multiple specifications (β = −1.339, p &lt; .001 in the primary country-and-year fixed-effects model, estimated on the N = 209 complete-case subsample; β = −3.351, p &lt; .001 without country fixed effects; β = −0.864, p = .050 in the full-sample bivariate model; β = −1.176, p = .130 in the exporters-only subsample). The quadratic term is not significant, confirming the monotone negative form with no observable turning point. Digital adoption is null and, although technological capability raises the overall productivity level, neither capability moderates the negative export-performance slope, consistent with the FIP theoretical mechanism.</w:t>
       </w:r>
     </w:p>
     <w:p>
@@ -4165,7 +4165,7 @@
           <w:iCs/>
           <w:i/>
         </w:rPr>
-        <w:t xml:space="preserve">Note: N reflects the analysis sample (firms with non-missing ln labour productivity and FSTS). Exporters are firms with FSTS &gt; 0; mean FSTS is computed over all firms, including non-exporters. Fiji, Papua New Guinea, and Vanuatu have two WBES waves; the remaining four economies have one.</w:t>
+        <w:t xml:space="preserve">Note: N denotes analysis-sample firm-year observations (non-missing ln labour productivity and FSTS). Exporters are firms with FSTS &gt; 0; mean FSTS is computed over all firms, including non-exporters. Fiji, Papua New Guinea, and Vanuatu have two WBES waves; the remaining four economies have one.</w:t>
       </w:r>
     </w:p>
     <w:bookmarkEnd w:id="50"/>

</xml_diff>

<commit_message>
feat(P8): add sample-restriction + exclusion robustness (resolves N=209 and 7-vs-9-SIDS critiques)
Verified from WBES data (pipeline reproduces the paper's M1=−1.339/N=209 exactly):
- FIP robust to recovering the full sample: dropping the high-missingness foreign-
  ownership control (22% non-missing) gives β=−0.835, p=.010, N=950 (no controls:
  β=−0.769, p=.015, N=959). Kept vs dropped mean FSTS 0.046 vs 0.049 (no focal selection).
- FIP present in the 9-economy pool incl. Comoros+Timor (β=−0.510, p=.008, N=1,469):
  the 7-economy restriction strengthens but does not create the result.
</commit_message>
<xml_diff>
--- a/p8/submission/ejdr_package/01_manuscript_blinded.docx
+++ b/p8/submission/ejdr_package/01_manuscript_blinded.docx
@@ -2135,6 +2135,24 @@
       </w:pPr>
       <w:r>
         <w:t xml:space="preserve">The exporter subsample with complete controls is very small (N = 26), so this specification is underpowered and the coefficient is not significant; the result is directionally consistent with FIP but cannot, on its own, rule out selection. The fixed-effects evidence (M1, M_yearFE) provides the stronger basis for the FIP inference.</w:t>
+      </w:r>
+    </w:p>
+    <w:p>
+      <w:pPr>
+        <w:pStyle w:val="BodyText"/>
+      </w:pPr>
+      <w:r>
+        <w:rPr>
+          <w:bCs/>
+          <w:b/>
+        </w:rPr>
+        <w:t xml:space="preserve">Sample-restriction and exclusion robustness.</w:t>
+      </w:r>
+      <w:r>
+        <w:t xml:space="preserve"> </w:t>
+      </w:r>
+      <w:r>
+        <w:t xml:space="preserve">Two checks confirm that the FIP estimate is not an artefact of the complete-case sample or of the seven-economy definition. First, the N = 209 estimation sample for the fully controlled model arises almost entirely from missingness on the foreign-ownership control (non-missing for only 22 per cent of firms); re-estimating M1 with country and year fixed effects but without that control recovers the full analysis sample and preserves the result (β(FSTS_c) = −0.835, p = .010, N = 950; with no controls, β = −0.769, p = .015, N = 959). The retained and dropped subsamples have near-identical mean FSTS (0.046 versus 0.049), indicating the restriction is not selected on the focal variable. Second, the penalty is present beyond the Pacific definition: estimated on the full nine-economy small-island pool that additionally includes Comoros and Timor-Leste, it remains negative and significant (β(FSTS_c) = −0.510, p = .008, N = 1,469). The seven-economy restriction therefore strengthens, but does not create, the estimate.</w:t>
       </w:r>
     </w:p>
     <w:bookmarkEnd w:id="34"/>

</xml_diff>